<commit_message>
Prepare audited V8 R3 manuscript and offline raw-data reproduction
</commit_message>
<xml_diff>
--- a/DOCUMENTATION/manuscript.docx
+++ b/DOCUMENTATION/manuscript.docx
@@ -25,7 +25,7 @@
           <w:b/>
           <w:bCs/>
         </w:rPr>
-        <w:t xml:space="preserve">AI now participates in mathematical research and sustained scientific work. How do humans and agents, through historically situated joint practice, form capacities that change their subsequent conditions of problem solving? Mathematicians’ concerns about understanding, OpenAI’s Navier–Stokes process account and persistent-agent workflows make this question concrete.¹–³ We examine the formation, adoption and reconstruction of relations connecting problems, methods, evidence and responsibilities. A finite construction establishes that equality of a specified current readout need not determine the correction required next: correction from that readout alone has a positive lower bound, removed by a compact state-aware rule. Archived agent records show feedback-driven programme revision and reuse under changed targets. In one revision, a non-zero component cancels an inherited-state term and improves the whole, relinquishing an already exact subresult. Separately, a selected known-proof completion turns shared declarations into a premise used downstream: with explicit researcher-written guidance, the third candidate is accepted in the saved compilation record, whereas the comparison remains incomplete. Convergence, unchanged versions and execution-dependent contrasts remain part of these records, which do not establish a general history effect. Together, the mathematical separation, sufficient repair and traceable instances distinguish obtaining results from forming and sustaining the relations that make them usable for further discovery.</w:t>
+        <w:t xml:space="preserve">AI participates in mathematical research and sustained scientific work. How does historically situated human–agent practice form capacities that change subsequent problem-solving conditions? Mathematicians warn that AI’s problem-solving gains can diverge from mathematical goals: understanding, method development and transmission, training researchers and asking new questions. OpenAI’s Navier–Stokes account describes intermediate results organised into conditions for later work; persistent agents make retaining, accessing, revising and using these conditions operational.¹–³ Our account examines how relations between problems, methods, evidence and responsibilities are formed and rebuilt; mathematics establishes insufficiency and sufficient repair, while process records trace formation, revision and reuse. A finite construction shows that equal specified current readouts need not determine the next correction: readout-only correction has a positive lower bound on error, removed by a compact state-aware rule. Recorded programmes undergo feedback-driven revision and changed-target reuse. Counterintuitively, one revision relinquishes local exactness so a non-zero residual cancels an inherited-state term and improves the whole: earlier work can create conditions requiring reconstruction of a previously successful operation. Separately, in a selected known-proof completion, shared declarations become a premise used downstream: with explicit researcher-written applicability guidance, the third candidate is accepted in saved compilation; the comparison remains incomplete. Convergence, unchanged versions and execution-dependent contrasts remain; no general history effect is established. The separation and records distinguish obtaining results from sustaining their future usability, making the formation, adoption, maintenance and reconstruction of research conditions an explicit research object with identifiable people, records and tools, inspectable processes and testable consequences.</w:t>
       </w:r>
     </w:p>
     <w:bookmarkStart w:id="9" w:name="introduction"/>
@@ -51,7 +51,16 @@
         <w:widowControl/>
       </w:pPr>
       <w:r>
-        <w:t xml:space="preserve">As artificial intelligence becomes more capable and enters scientific work more directly, getting a result and sustaining the capacity to develop it become distinct practical concerns. Mathematicians’ joint statement stresses understanding, method transmission, training and new questions as purposes of problem solving.¹ OpenAI’s published Navier–Stokes (NS) account describes intermediate Euler results being incorporated into subsequent NS work and group insights being reorganised for further investigation.² In persistent Codex workflows, working files, notes, context transitions and tool feedback make retaining and revising earlier work concrete operations.³ These settings expose a common question: when people and AI produce useful results, what conditions do they also form for inquiry to continue?</w:t>
+        <w:t xml:space="preserve">Mathematicians’ statement warns that growing AI success in producing answers need not also form the understanding, methods and capacities for further inquiry that mathematical practice seeks.¹ It treats problem solving as a means towards understanding, training as a way of building understanding and the ability to ask new questions, and explanation, refinement and transmission within the community as conditions for methods and ideas to become usable by others.</w:t>
+      </w:r>
+    </w:p>
+    <w:p>
+      <w:pPr>
+        <w:pStyle w:val="BodyText"/>
+        <w:widowControl/>
+      </w:pPr>
+      <w:r>
+        <w:t xml:space="preserve">OpenAI’s published Navier–Stokes (NS) account illustrates a complementary relation: intermediate results can become conditions for subsequent research through judgement, organisation and actual adoption.² After the Euler result, the researchers selected NS as the most promising direction, redirected agents from other problems and supplied that result to the continuing groups. Codex subsequently consolidated insights across groups into guidance for further work. The account also reports an update to a more extensively trained model during the effort, so these events describe an organised process with several changing factors. In persistent Codex workflows, working files, notes, context transitions and tool feedback make retaining and revising earlier work concrete operations.³ These settings expose a common question: when people and AI produce useful results, what conditions do they also form for inquiry to continue?</w:t>
       </w:r>
     </w:p>
     <w:p>
@@ -2411,7 +2420,7 @@
         <w:t xml:space="preserve"> </w:t>
       </w:r>
       <w:r>
-        <w:t xml:space="preserve">supports the observations, permitted actions, successor updates and costs required by a declared family of future duties. If these laws factor through</w:t>
+        <w:t xml:space="preserve">supports the observations, permitted actions, successor updates and costs required by a declared family of future duties. Under common joint kernels, matched exogenous-input laws and the initial-history conditions of Supplementary Note 3, factorisation through</w:t>
       </w:r>
       <w:r>
         <w:t xml:space="preserve"> </w:t>
@@ -2425,7 +2434,7 @@
         <w:t xml:space="preserve"> </w:t>
       </w:r>
       <w:r>
-        <w:t xml:space="preserve">and its successor can be updated by the same rule, a matched policy reproduces the relevant finite continuation law. This is the standard sufficient-state composition principle, proved by induction in Supplementary Note 3 and consistent with predictive representations.⁸ The result includes the transitions: reproducing today’s answer alone is insufficient. Legitimate rederivation also supplies a sufficient route when its construction and retrieval costs fit the specified budget.</w:t>
+        <w:t xml:space="preserve">and a common compact-state update reproduce the relevant finite continuation law. This is the standard sufficient-state composition principle, proved by induction in Supplementary Note 3 and consistent with predictive representations.⁸ The result includes the transitions: reproducing today’s answer alone is insufficient. Legitimate rederivation also supplies a sufficient route when its construction and retrieval costs fit the specified budget.</w:t>
       </w:r>
     </w:p>
     <w:p>
@@ -2849,7 +2858,7 @@
         </m:r>
       </m:oMath>
       <w:r>
-        <w:t xml:space="preserve">: its pure residual is exactly zero, yet its full successor residual is</w:t>
+        <w:t xml:space="preserve">. At formation, the declared core was evaluated from the fixed base, so the pure residual also described the complete residual. In the subsequent duty, the actual state produced by that work was inherited rather than reset. The same rule still made the pure residual exactly zero, but its full successor residual was</w:t>
       </w:r>
       <w:r>
         <w:t xml:space="preserve"> </w:t>
@@ -2887,7 +2896,16 @@
         </m:r>
       </m:oMath>
       <w:r>
-        <w:t xml:space="preserve">. The agent’s first revision introduced</w:t>
+        <w:t xml:space="preserve">.</w:t>
+      </w:r>
+    </w:p>
+    <w:p>
+      <w:pPr>
+        <w:pStyle w:val="BodyText"/>
+        <w:widowControl/>
+      </w:pPr>
+      <w:r>
+        <w:t xml:space="preserve">Within this first continuation, the initial, draft and final versions used the same incoming state and target at each matched coordinate. The agent’s first revision introduced</w:t>
       </w:r>
       <w:r>
         <w:t xml:space="preserve"> </w:t>
@@ -3157,7 +3175,16 @@
         <w:t xml:space="preserve"> </w:t>
       </w:r>
       <w:r>
-        <w:t xml:space="preserve">and an exactly zero complete residual. The recorded next continuation received and retained that actual programme and used its predecessor’s state. Crucially, the revised pure residual is generally non-zero: it cancels the inherited-state cross term. Correct continuation here required relinquishing a locally exact subresult, not improving every component separately.</w:t>
+        <w:t xml:space="preserve">and an exactly zero complete residual. Crucially, the revised pure residual is generally non-zero: it cancels the inherited-state cross term. Correct continuation here required relinquishing a locally exact subresult, not improving every component separately.</w:t>
+      </w:r>
+    </w:p>
+    <w:p>
+      <w:pPr>
+        <w:pStyle w:val="BodyText"/>
+        <w:widowControl/>
+      </w:pPr>
+      <w:r>
+        <w:t xml:space="preserve">The recorded next continuation received and retained that actual programme and used its predecessor’s state for a changed target. The within-duty version comparison documents reconstruction; the subsequent duty documents inheritance and actual renewed use. Because the inherited state and target changed, the latter is not another comparison under the same conditions. The programme’s availability and its adoption as a condition of further work are separately visible in this record.</w:t>
       </w:r>
     </w:p>
     <w:p>
@@ -4476,6 +4503,15 @@
         <w:t xml:space="preserve">These distinctions also prevent several different histories from receiving the same explanation. An empty terminal return records no final programme, not proof that a method was never formed; a draft may already exist. Identical code can still be adopted and used on an inherited state. A failed conversion of an existing lemma concerns applicability at the consumer interface, not absence of the lemma. Changed-target revision followed by renewed use is documented in the coefficient traces; first non-formation, an available method never adopted, and restoration of a lost arrangement remain distinct theoretical possibilities rather than additional observed categories in these records. Formation of the accepted proof object does not measure a change in human understanding.</w:t>
       </w:r>
     </w:p>
+    <w:p>
+      <w:pPr>
+        <w:pStyle w:val="BodyText"/>
+        <w:widowControl/>
+      </w:pPr>
+      <w:r>
+        <w:t xml:space="preserve">In the coefficient trace, the earlier rule remained available; what changed was its relation to the inherited state and target. The record therefore locates reconstruction of applicability and subsequent adoption, rather than disappearance of the method.</w:t>
+      </w:r>
+    </w:p>
     <w:bookmarkEnd w:id="15"/>
     <w:bookmarkStart w:id="16" w:name="conditions-for-further-discovery"/>
     <w:p>
@@ -6722,7 +6758,7 @@
         <w:rPr>
           <w:sz w:val="20"/>
         </w:rPr>
-        <w:t xml:space="preserve">, The proof task required two transports from the common source representation to the consumer’s representation: interval membership and the whole dependent inequality, not interval membership alone.</w:t>
+        <w:t xml:space="preserve">, The proof first transports interval membership into the source hypothesis’s representation, then transports the resulting dependent inequality back into the consumer’s representation; membership transport alone is insufficient.</w:t>
       </w:r>
       <w:r>
         <w:rPr>
@@ -7400,7 +7436,7 @@
         <w:widowControl/>
       </w:pPr>
       <w:r>
-        <w:t xml:space="preserve">The recorded model identifier was</w:t>
+        <w:t xml:space="preserve">The recorded serving alias was</w:t>
       </w:r>
       <w:r>
         <w:t xml:space="preserve"> </w:t>
@@ -7409,7 +7445,19 @@
         <w:rPr>
           <w:rStyle w:val="VerbatimChar"/>
         </w:rPr>
-        <w:t xml:space="preserve">Qwen/Qwen3.8-27B-FP8</w:t>
+        <w:t xml:space="preserve">qwen3.8-27b-fp8-a256k-nomtp-c1</w:t>
+      </w:r>
+      <w:r>
+        <w:t xml:space="preserve">, with local model-root basename</w:t>
+      </w:r>
+      <w:r>
+        <w:t xml:space="preserve"> </w:t>
+      </w:r>
+      <w:r>
+        <w:rPr>
+          <w:rStyle w:val="VerbatimChar"/>
+        </w:rPr>
+        <w:t xml:space="preserve">Qwen3.8-27B-FP8</w:t>
       </w:r>
       <w:r>
         <w:t xml:space="preserve">. The deployment records specify 262,144-token context, one globally active generation, MTP disabled, half-precision computation, tensor parallelism 2,</w:t>
@@ -7493,7 +7541,7 @@
         <w:widowControl/>
       </w:pPr>
       <w:r>
-        <w:t xml:space="preserve">Record analysis reread the original handoff and reran the auditor in an isolated output directory. It verified the 859 payload identities, reconstructed all six response streams, matched the five candidate insertions and compiler receipts, and checked the 243 shared work-tree files outside the candidate module. The original collector duplicated two mirrored reasoning fields; their bytes are retained and the duplication documented. Only visible proof bodies and compiler feedback entered later requests; server usage is the token source. These checks reproduce recorded acceptance, not a new trusted compilation. The saved-candidate replay script reports the actual availability of Lean, Lake and the required 4.34.0-rc2 environment; no compatible toolchain was available for this analysis. No new Lean or independent-kernel validation is claimed.¹⁹</w:t>
+        <w:t xml:space="preserve">Record analysis reread the original handoff and reran the auditor in an isolated output directory. It verified the 859 payload identities, reconstructed all six response streams, matched the five candidate insertions and compiler receipts, and checked the 243 shared work-tree files outside the candidate module. The original collector duplicated two mirrored reasoning fields; their bytes are retained and the duplication documented. Only visible proof bodies and compiler feedback entered later requests; server usage is the token source. These record checks were followed by offline recompilation of the five unchanged saved candidates under Lean 4.34.0-rc2 and the pinned dependencies. The ordinary Lean replay reproduced one acceptance and four rejections; the truncated request has no candidate to compile. This checks the saved candidates with the same compiler family, not with an independent kernel.¹⁹</w:t>
       </w:r>
     </w:p>
     <w:bookmarkEnd w:id="23"/>
@@ -7733,7 +7781,7 @@
         <w:t xml:space="preserve"> </w:t>
       </w:r>
       <w:r>
-        <w:t xml:space="preserve">identifies the input and output of each offline command and its verification layer. Default entry points do not contact a model service. Saved-candidate compilation requires Lean 4.34.0-rc2 and the pinned dependencies; it remains unexecuted in this revision, separately from independent-kernel verification. Third-party notices accompany their sources. The prepared repository destination is Wangziqi0/MaoField, on a local nature-main candidate that preserves the older main branch and R3.0 history. A remote branch publication, default-branch switch and GitHub–Zenodo automatic archive have not been executed; no permanent address for this new code release is asserted.</w:t>
+        <w:t xml:space="preserve">identifies the input and output of each offline command and its verification layer. Default entry points do not contact a model service. The one-command entry point uses packaged Python and Lean 4.34.0-rc2 environments, verifies the raw-data identities, reruns the mathematical and record checks, and recompiles the five unchanged saved candidates offline. Ordinary Lean replay has been executed; independent-kernel verification remains unexecuted. Third-party notices accompany their sources. The prepared repository destination is Wangziqi0/MaoField, on a local nature-main candidate that preserves the older main branch and R3.0 history. A remote branch publication, default-branch switch and GitHub–Zenodo automatic archive have not been executed; no permanent address for this new code release is asserted.</w:t>
       </w:r>
     </w:p>
     <w:bookmarkEnd w:id="28"/>

</xml_diff>

<commit_message>
Link publication archives and enable verified release downloads
</commit_message>
<xml_diff>
--- a/DOCUMENTATION/manuscript.docx
+++ b/DOCUMENTATION/manuscript.docx
@@ -7739,7 +7739,7 @@
         <w:t xml:space="preserve">MAOFIELD_REVIEW_SUPPORT.zip</w:t>
       </w:r>
       <w:r>
-        <w:t xml:space="preserve">. The successor material preserves all recorded terminal outcomes and original study denominators, with separately identified explanatory traces. Provenance maps identify every supplied excerpt and any privacy transformation. Unmodified originals are retained in the separate internal evidence archive. Local release candidates additionally preserve the full scientific raw records, with file-level provenance and only necessary non-scientific redactions. This broader sharing scope does not enlarge the analysis inputs, observation units or original denominators. The new manuscript, software and raw records are prepared as three linked Zenodo records; deposition and public release have not occurred. Original data, text and figures are designated CC BY 4.0 and original code Apache-2.0, with third-party rights preserved.</w:t>
+        <w:t xml:space="preserve">. The successor material preserves all recorded terminal outcomes and original study denominators, with separately identified explanatory traces. Provenance maps identify every supplied excerpt and any privacy transformation. The full retained scientific raw records, with file-level provenance, are archived at https://doi.org/10.5281/zenodo.22904604. This broader sharing scope does not enlarge the analysis inputs, observation units or original denominators. The associated preprint is https://doi.org/10.5281/zenodo.22904545. Original data, text and figures are CC BY 4.0 and original code Apache-2.0, to the extent of the contributor’s rights; third-party rights and notices remain in force.</w:t>
       </w:r>
     </w:p>
     <w:bookmarkEnd w:id="27"/>
@@ -7781,7 +7781,7 @@
         <w:t xml:space="preserve"> </w:t>
       </w:r>
       <w:r>
-        <w:t xml:space="preserve">identifies the input and output of each offline command and its verification layer. Default entry points do not contact a model service. The one-command entry point uses packaged Python and Lean 4.34.0-rc2 environments, verifies the raw-data identities, reruns the mathematical and record checks, and recompiles the five unchanged saved candidates offline. Ordinary Lean replay has been executed; independent-kernel verification remains unexecuted. Third-party notices accompany their sources. The prepared repository destination is Wangziqi0/MaoField, on a local nature-main candidate that preserves the older main branch and R3.0 history. A remote branch publication, default-branch switch and GitHub–Zenodo automatic archive have not been executed; no permanent address for this new code release is asserted.</w:t>
+        <w:t xml:space="preserve">identifies the input and output of each offline command and its verification layer. Default entry points do not contact a model service. The one-command entry point uses packaged Python and Lean 4.34.0-rc2 environments, verifies the raw-data identities, reruns the mathematical and record checks, and recompiles the five unchanged saved candidates offline. Ordinary Lean replay has been executed; independent-kernel verification remains unexecuted. Third-party notices accompany their sources. The repository is https://github.com/Wangziqi0/MaoField/tree/nature-main, with the fixed release tagged nature-v8-r3. Software, original study data and packaged reproduction environments are archived at https://doi.org/10.5281/zenodo.22904605. Missing environment assets can be downloaded from that fixed GitHub release and are hash-verified before use; mathematical analysis and candidate compilation then run offline. The older main branch and R3.0 history remain distinct.</w:t>
       </w:r>
     </w:p>
     <w:bookmarkEnd w:id="28"/>

</xml_diff>

<commit_message>
Use PI-selected formal subtitle and versioned publication links
</commit_message>
<xml_diff>
--- a/DOCUMENTATION/manuscript.docx
+++ b/DOCUMENTATION/manuscript.docx
@@ -12,7 +12,7 @@
           <w:rFonts w:ascii="Times New Roman" w:hAnsi="Times New Roman"/>
           <w:color w:val="000000"/>
         </w:rPr>
-        <w:t xml:space="preserve">Why can equal results lead to different scientific futures</w:t>
+        <w:t xml:space="preserve">Why can equal results lead to different scientific futures: How humans and AI jointly form the conditions for further discovery</w:t>
       </w:r>
     </w:p>
     <w:p>
@@ -7739,7 +7739,7 @@
         <w:t xml:space="preserve">MAOFIELD_REVIEW_SUPPORT.zip</w:t>
       </w:r>
       <w:r>
-        <w:t xml:space="preserve">. The successor material preserves all recorded terminal outcomes and original study denominators, with separately identified explanatory traces. Provenance maps identify every supplied excerpt and any privacy transformation. The full retained scientific raw records, with file-level provenance, are archived at https://doi.org/10.5281/zenodo.22904604. This broader sharing scope does not enlarge the analysis inputs, observation units or original denominators. The associated preprint is https://doi.org/10.5281/zenodo.22904545. Original data, text and figures are CC BY 4.0 and original code Apache-2.0, to the extent of the contributor’s rights; third-party rights and notices remain in force.</w:t>
+        <w:t xml:space="preserve">. The successor material preserves all recorded terminal outcomes and original study denominators, with separately identified explanatory traces. Provenance maps identify every supplied excerpt and any privacy transformation. The full retained scientific raw records, with file-level provenance, are archived at https://doi.org/10.5281/zenodo.22904604. This broader sharing scope does not enlarge the analysis inputs, observation units or original denominators. The associated preprint is https://doi.org/10.5281/zenodo.22905100. Original data, text and figures are CC BY 4.0 and original code Apache-2.0, to the extent of the contributor’s rights; third-party rights and notices remain in force.</w:t>
       </w:r>
     </w:p>
     <w:bookmarkEnd w:id="27"/>
@@ -7781,7 +7781,7 @@
         <w:t xml:space="preserve"> </w:t>
       </w:r>
       <w:r>
-        <w:t xml:space="preserve">identifies the input and output of each offline command and its verification layer. Default entry points do not contact a model service. The one-command entry point uses packaged Python and Lean 4.34.0-rc2 environments, verifies the raw-data identities, reruns the mathematical and record checks, and recompiles the five unchanged saved candidates offline. Ordinary Lean replay has been executed; independent-kernel verification remains unexecuted. Third-party notices accompany their sources. The repository is https://github.com/Wangziqi0/MaoField/tree/nature-main, with the fixed release tagged nature-v8-r3. Software, original study data and packaged reproduction environments are archived at https://doi.org/10.5281/zenodo.22904605. Missing environment assets can be downloaded from that fixed GitHub release and are hash-verified before use; mathematical analysis and candidate compilation then run offline. The older main branch and R3.0 history remain distinct.</w:t>
+        <w:t xml:space="preserve">identifies the input and output of each offline command and its verification layer. Default entry points do not contact a model service. The one-command entry point uses packaged Python and Lean 4.34.0-rc2 environments, verifies the raw-data identities, reruns the mathematical and record checks, and recompiles the five unchanged saved candidates offline. Ordinary Lean replay has been executed; independent-kernel verification remains unexecuted. Third-party notices accompany their sources. The repository is https://github.com/Wangziqi0/MaoField/tree/nature-main, with the fixed release tagged nature-v8-r3. Software, original study data and packaged reproduction environments are archived at https://doi.org/10.5281/zenodo.22905103. Missing environment assets can be downloaded from that fixed GitHub release and are hash-verified before use; mathematical analysis and candidate compilation then run offline. The older main branch and R3.0 history remain distinct.</w:t>
       </w:r>
     </w:p>
     <w:bookmarkEnd w:id="28"/>

</xml_diff>